<commit_message>
Publish completed ordinary Arm64 replay and three-machine one-page report
Co-authored-by: Copilot <223556219+Copilot@users.noreply.github.com>
</commit_message>
<xml_diff>
--- a/ci-benchmark/matched-release/Self-Hosted-Rust-Release-Pilots.docx
+++ b/ci-benchmark/matched-release/Self-Hosted-Rust-Release-Pilots.docx
@@ -309,6 +309,210 @@
           </w:tcPr>
           <w:p>
             <w:r>
+              <w:t>MARCPE-D4-Arm64 / 4 CPUs</w:t>
+              <w:br/>
+              <w:t>No PGO</w:t>
+            </w:r>
+          </w:p>
+        </w:tc>
+        <w:tc>
+          <w:tcPr>
+            <w:tcW w:type="dxa" w:w="2304"/>
+          </w:tcPr>
+          <w:p>
+            <w:r>
+              <w:t>180.1</w:t>
+              <w:br/>
+              <w:t>Reference</w:t>
+            </w:r>
+          </w:p>
+        </w:tc>
+        <w:tc>
+          <w:tcPr>
+            <w:tcW w:type="dxa" w:w="2304"/>
+          </w:tcPr>
+          <w:p>
+            <w:r>
+              <w:t>277.9</w:t>
+              <w:br/>
+              <w:t>Reference</w:t>
+            </w:r>
+          </w:p>
+        </w:tc>
+        <w:tc>
+          <w:tcPr>
+            <w:tcW w:type="dxa" w:w="1584"/>
+          </w:tcPr>
+          <w:p>
+            <w:r>
+              <w:t>0.0</w:t>
+            </w:r>
+          </w:p>
+        </w:tc>
+        <w:tc>
+          <w:tcPr>
+            <w:tcW w:type="dxa" w:w="2304"/>
+          </w:tcPr>
+          <w:p>
+            <w:r>
+              <w:t>1348.5</w:t>
+            </w:r>
+          </w:p>
+        </w:tc>
+        <w:tc>
+          <w:tcPr>
+            <w:tcW w:type="dxa" w:w="2304"/>
+          </w:tcPr>
+          <w:p>
+            <w:r>
+              <w:t>Reference</w:t>
+            </w:r>
+          </w:p>
+        </w:tc>
+      </w:tr>
+      <w:tr>
+        <w:tc>
+          <w:tcPr>
+            <w:tcW w:type="dxa" w:w="4608"/>
+          </w:tcPr>
+          <w:p>
+            <w:r>
+              <w:t>MARCPE-D4-Arm64 / 4 CPUs</w:t>
+              <w:br/>
+              <w:t>PGO / Microsoft retained</w:t>
+            </w:r>
+          </w:p>
+        </w:tc>
+        <w:tc>
+          <w:tcPr>
+            <w:tcW w:type="dxa" w:w="2304"/>
+          </w:tcPr>
+          <w:p>
+            <w:r>
+              <w:t>431.9</w:t>
+              <w:br/>
+              <w:t>+139.8%</w:t>
+            </w:r>
+          </w:p>
+        </w:tc>
+        <w:tc>
+          <w:tcPr>
+            <w:tcW w:type="dxa" w:w="2304"/>
+          </w:tcPr>
+          <w:p>
+            <w:r>
+              <w:t>528.5</w:t>
+              <w:br/>
+              <w:t>+90.1%</w:t>
+            </w:r>
+          </w:p>
+        </w:tc>
+        <w:tc>
+          <w:tcPr>
+            <w:tcW w:type="dxa" w:w="1584"/>
+          </w:tcPr>
+          <w:p>
+            <w:r>
+              <w:t>2.3</w:t>
+            </w:r>
+          </w:p>
+        </w:tc>
+        <w:tc>
+          <w:tcPr>
+            <w:tcW w:type="dxa" w:w="2304"/>
+          </w:tcPr>
+          <w:p>
+            <w:r>
+              <w:t>1018.9</w:t>
+            </w:r>
+          </w:p>
+        </w:tc>
+        <w:tc>
+          <w:tcPr>
+            <w:tcW w:type="dxa" w:w="2304"/>
+          </w:tcPr>
+          <w:p>
+            <w:r>
+              <w:t>24.4%</w:t>
+            </w:r>
+          </w:p>
+        </w:tc>
+      </w:tr>
+      <w:tr>
+        <w:tc>
+          <w:tcPr>
+            <w:tcW w:type="dxa" w:w="4608"/>
+          </w:tcPr>
+          <w:p>
+            <w:r>
+              <w:t>MARCPE-D4-Arm64 / 4 CPUs</w:t>
+              <w:br/>
+              <w:t>PGO + ThinLTO / LLVM</w:t>
+            </w:r>
+          </w:p>
+        </w:tc>
+        <w:tc>
+          <w:tcPr>
+            <w:tcW w:type="dxa" w:w="2304"/>
+          </w:tcPr>
+          <w:p>
+            <w:r>
+              <w:t>656.4</w:t>
+              <w:br/>
+              <w:t>+264.5%</w:t>
+            </w:r>
+          </w:p>
+        </w:tc>
+        <w:tc>
+          <w:tcPr>
+            <w:tcW w:type="dxa" w:w="2304"/>
+          </w:tcPr>
+          <w:p>
+            <w:r>
+              <w:t>760.0</w:t>
+              <w:br/>
+              <w:t>+173.4%</w:t>
+            </w:r>
+          </w:p>
+        </w:tc>
+        <w:tc>
+          <w:tcPr>
+            <w:tcW w:type="dxa" w:w="1584"/>
+          </w:tcPr>
+          <w:p>
+            <w:r>
+              <w:t>2.6</w:t>
+            </w:r>
+          </w:p>
+        </w:tc>
+        <w:tc>
+          <w:tcPr>
+            <w:tcW w:type="dxa" w:w="2304"/>
+          </w:tcPr>
+          <w:p>
+            <w:r>
+              <w:t>972.7</w:t>
+            </w:r>
+          </w:p>
+        </w:tc>
+        <w:tc>
+          <w:tcPr>
+            <w:tcW w:type="dxa" w:w="2304"/>
+          </w:tcPr>
+          <w:p>
+            <w:r>
+              <w:t>27.9%</w:t>
+            </w:r>
+          </w:p>
+        </w:tc>
+      </w:tr>
+      <w:tr>
+        <w:tc>
+          <w:tcPr>
+            <w:tcW w:type="dxa" w:w="4608"/>
+          </w:tcPr>
+          <w:p>
+            <w:r>
               <w:t>GB300-Arm64 / 64 CPUs</w:t>
               <w:br/>
               <w:t>No PGO</w:t>
@@ -529,12 +733,17 @@
     </w:p>
     <w:p>
       <w:r>
+        <w:t>self-hosted-arm64: baseline: 38225557840, msvc-pgo: 38532798400, llvm-pgo-thin: 38542164879; IronRDP 38695519744. Rust 7db17d9b5bbe; github.com/marcpems/IronRDP-ci-benchmark</w:t>
+      </w:r>
+    </w:p>
+    <w:p>
+      <w:r>
         <w:t>self-hosted-arm64-highcore: baseline: 38282254692, msvc-pgo: 38368036985, llvm-pgo-thin: 38397813994; IronRDP 38441909371. Rust 7db17d9b5bbe; github.com/marcpems/IronRDP-ci-benchmark</w:t>
       </w:r>
     </w:p>
     <w:p>
       <w:r>
-        <w:t>Qualification history: x64 first replay failed an NTFS-only object-ID test on ReFS; only correctness TEMP/TMP moved to C: NTFS, with timed builds unchanged on E:. GB300 first replay failed UDP shutdown; cause remains unexplained. Diagnostics and fresh full replays passed; neither pilot reuses failed-run blocks.</w:t>
+        <w:t>Qualification history: x64 failed an NTFS-only object-ID test on ReFS; ordinary Arm64 stopped at ReFS preflight. Only correctness TEMP/TMP moved to C: NTFS; timed builds remain on E: (x64) / D: (Arm64). GB300 first replay failed UDP shutdown; cause remains unexplained. Diagnostics and fresh full replays passed; no pilot reuses failed-run blocks.</w:t>
       </w:r>
     </w:p>
     <w:sectPr>
@@ -911,11 +1120,11 @@
     <w:qFormat/>
     <w:rsid w:val="00FC693F"/>
     <w:pPr>
-      <w:spacing w:after="100"/>
+      <w:spacing w:after="40"/>
     </w:pPr>
     <w:rPr>
       <w:rFonts w:ascii="Calibri" w:hAnsi="Calibri"/>
-      <w:sz w:val="20"/>
+      <w:sz w:val="18"/>
     </w:rPr>
   </w:style>
   <w:style w:type="paragraph" w:styleId="Header">

</xml_diff>